<commit_message>
Deploying to gh-pages from @ shuvom-s/shuvom-s.github.io@db5f2e71b22d383c7c4649b3581ec5eb4e8fbefe 🚀
</commit_message>
<xml_diff>
--- a/assets/pdf/cv_jul26.docx
+++ b/assets/pdf/cv_jul26.docx
@@ -949,27 +949,7 @@
           <w:sz w:val="24"/>
           <w:szCs w:val="24"/>
         </w:rPr>
-        <w:t xml:space="preserve">, D. Prinster, C. </w:t>
-      </w:r>
-      <w:proofErr w:type="spellStart"/>
-      <w:r>
-        <w:rPr>
-          <w:rFonts w:ascii="Times New Roman" w:hAnsi="Times New Roman" w:cs="Times New Roman"/>
-          <w:bCs/>
-          <w:sz w:val="24"/>
-          <w:szCs w:val="24"/>
-        </w:rPr>
-        <w:t>Fannjiang</w:t>
-      </w:r>
-      <w:proofErr w:type="spellEnd"/>
-      <w:r>
-        <w:rPr>
-          <w:rFonts w:ascii="Times New Roman" w:hAnsi="Times New Roman" w:cs="Times New Roman"/>
-          <w:bCs/>
-          <w:sz w:val="24"/>
-          <w:szCs w:val="24"/>
-        </w:rPr>
-        <w:t xml:space="preserve">, G. Scalia, A. Regev, H. Wang. </w:t>
+        <w:t xml:space="preserve">, D. Prinster, C. Fannjiang, G. Scalia, A. Regev, H. Wang. </w:t>
       </w:r>
       <w:r>
         <w:rPr>
@@ -1009,30 +989,18 @@
         </w:rPr>
         <w:t>(</w:t>
       </w:r>
-      <w:proofErr w:type="spellStart"/>
-      <w:r>
-        <w:fldChar w:fldCharType="begin"/>
-      </w:r>
-      <w:r>
-        <w:instrText>HYPERLINK "https://arxiv.org/abs/2512.03109"</w:instrText>
-      </w:r>
-      <w:r>
-        <w:fldChar w:fldCharType="separate"/>
-      </w:r>
-      <w:r>
-        <w:rPr>
-          <w:rStyle w:val="Hyperlink"/>
-          <w:rFonts w:ascii="Times New Roman" w:hAnsi="Times New Roman" w:cs="Times New Roman"/>
-          <w:bCs/>
-          <w:sz w:val="24"/>
-          <w:szCs w:val="24"/>
-        </w:rPr>
-        <w:t>arxiv</w:t>
-      </w:r>
-      <w:proofErr w:type="spellEnd"/>
-      <w:r>
-        <w:fldChar w:fldCharType="end"/>
-      </w:r>
+      <w:hyperlink r:id="rId9" w:history="1">
+        <w:r>
+          <w:rPr>
+            <w:rStyle w:val="Hyperlink"/>
+            <w:rFonts w:ascii="Times New Roman" w:hAnsi="Times New Roman" w:cs="Times New Roman"/>
+            <w:bCs/>
+            <w:sz w:val="24"/>
+            <w:szCs w:val="24"/>
+          </w:rPr>
+          <w:t>arxiv</w:t>
+        </w:r>
+      </w:hyperlink>
       <w:r>
         <w:rPr>
           <w:rFonts w:ascii="Times New Roman" w:hAnsi="Times New Roman" w:cs="Times New Roman"/>
@@ -1096,47 +1064,7 @@
           <w:sz w:val="24"/>
           <w:szCs w:val="24"/>
         </w:rPr>
-        <w:t xml:space="preserve">, S. </w:t>
-      </w:r>
-      <w:proofErr w:type="spellStart"/>
-      <w:r>
-        <w:rPr>
-          <w:rFonts w:ascii="Times New Roman" w:hAnsi="Times New Roman" w:cs="Times New Roman"/>
-          <w:bCs/>
-          <w:sz w:val="24"/>
-          <w:szCs w:val="24"/>
-        </w:rPr>
-        <w:t>Dandapanthula</w:t>
-      </w:r>
-      <w:proofErr w:type="spellEnd"/>
-      <w:r>
-        <w:rPr>
-          <w:rFonts w:ascii="Times New Roman" w:hAnsi="Times New Roman" w:cs="Times New Roman"/>
-          <w:bCs/>
-          <w:sz w:val="24"/>
-          <w:szCs w:val="24"/>
-        </w:rPr>
-        <w:t xml:space="preserve">, S. Khan, M. Oberst, B. Berger, A. </w:t>
-      </w:r>
-      <w:proofErr w:type="spellStart"/>
-      <w:r>
-        <w:rPr>
-          <w:rFonts w:ascii="Times New Roman" w:hAnsi="Times New Roman" w:cs="Times New Roman"/>
-          <w:bCs/>
-          <w:sz w:val="24"/>
-          <w:szCs w:val="24"/>
-        </w:rPr>
-        <w:t>Chouldechova</w:t>
-      </w:r>
-      <w:proofErr w:type="spellEnd"/>
-      <w:r>
-        <w:rPr>
-          <w:rFonts w:ascii="Times New Roman" w:hAnsi="Times New Roman" w:cs="Times New Roman"/>
-          <w:bCs/>
-          <w:sz w:val="24"/>
-          <w:szCs w:val="24"/>
-        </w:rPr>
-        <w:t xml:space="preserve">. </w:t>
+        <w:t xml:space="preserve">, S. Dandapanthula, S. Khan, M. Oberst, B. Berger, A. Chouldechova. </w:t>
       </w:r>
       <w:r>
         <w:rPr>
@@ -1202,94 +1130,29 @@
         <w:rPr>
           <w:rFonts w:ascii="Times New Roman" w:hAnsi="Times New Roman" w:cs="Times New Roman"/>
           <w:bCs/>
-          <w:sz w:val="24"/>
-          <w:szCs w:val="24"/>
-        </w:rPr>
-      </w:pPr>
-      <w:r>
-        <w:rPr>
-          <w:rFonts w:ascii="Times New Roman" w:hAnsi="Times New Roman" w:cs="Times New Roman"/>
-          <w:bCs/>
-          <w:sz w:val="24"/>
-          <w:szCs w:val="24"/>
-        </w:rPr>
-        <w:t xml:space="preserve">[p] S. Balachandar, </w:t>
-      </w:r>
-      <w:r>
-        <w:rPr>
-          <w:rFonts w:ascii="Times New Roman" w:hAnsi="Times New Roman" w:cs="Times New Roman"/>
-          <w:bCs/>
-          <w:sz w:val="24"/>
-          <w:szCs w:val="24"/>
-          <w:u w:val="single"/>
-        </w:rPr>
-        <w:t>S. Sadhuka</w:t>
-      </w:r>
-      <w:r>
-        <w:rPr>
-          <w:rFonts w:ascii="Times New Roman" w:hAnsi="Times New Roman" w:cs="Times New Roman"/>
-          <w:bCs/>
-          <w:sz w:val="24"/>
-          <w:szCs w:val="24"/>
-        </w:rPr>
-        <w:t xml:space="preserve">, B. Berger, E. Pierson, N. Garg. </w:t>
-      </w:r>
-      <w:r>
-        <w:rPr>
-          <w:rFonts w:ascii="Times New Roman" w:hAnsi="Times New Roman" w:cs="Times New Roman"/>
-          <w:bCs/>
           <w:i/>
           <w:iCs/>
           <w:sz w:val="24"/>
           <w:szCs w:val="24"/>
         </w:rPr>
-        <w:t>Urban Incident Prediction with Graph Neural Networks: Integrating Government Ratings and Crowdsourced Reports</w:t>
-      </w:r>
-      <w:r>
-        <w:rPr>
-          <w:rFonts w:ascii="Times New Roman" w:hAnsi="Times New Roman" w:cs="Times New Roman"/>
-          <w:bCs/>
-          <w:sz w:val="24"/>
-          <w:szCs w:val="24"/>
-        </w:rPr>
-        <w:t>. AAAI 2026</w:t>
-      </w:r>
-    </w:p>
-    <w:p>
-      <w:pPr>
-        <w:autoSpaceDE w:val="0"/>
-        <w:autoSpaceDN w:val="0"/>
-        <w:adjustRightInd w:val="0"/>
-        <w:spacing w:after="0" w:line="240" w:lineRule="auto"/>
-        <w:rPr>
-          <w:rFonts w:ascii="Times New Roman" w:hAnsi="Times New Roman" w:cs="Times New Roman"/>
-          <w:bCs/>
-          <w:sz w:val="24"/>
-          <w:szCs w:val="24"/>
-        </w:rPr>
-      </w:pPr>
-    </w:p>
-    <w:p>
-      <w:pPr>
-        <w:autoSpaceDE w:val="0"/>
-        <w:autoSpaceDN w:val="0"/>
-        <w:adjustRightInd w:val="0"/>
-        <w:spacing w:after="0" w:line="240" w:lineRule="auto"/>
-        <w:rPr>
-          <w:rFonts w:ascii="Times New Roman" w:hAnsi="Times New Roman" w:cs="Times New Roman"/>
-          <w:bCs/>
-          <w:sz w:val="24"/>
-          <w:szCs w:val="24"/>
-        </w:rPr>
-      </w:pPr>
-      <w:r>
-        <w:rPr>
-          <w:rFonts w:ascii="Times New Roman" w:hAnsi="Times New Roman" w:cs="Times New Roman"/>
-          <w:bCs/>
-          <w:sz w:val="24"/>
-          <w:szCs w:val="24"/>
-        </w:rPr>
-        <w:t xml:space="preserve">[p] D. Shanmugam*, </w:t>
+      </w:pPr>
+      <w:r>
+        <w:rPr>
+          <w:rFonts w:ascii="Times New Roman" w:hAnsi="Times New Roman" w:cs="Times New Roman"/>
+          <w:bCs/>
+          <w:sz w:val="24"/>
+          <w:szCs w:val="24"/>
+        </w:rPr>
+        <w:t>[w</w:t>
+      </w:r>
+      <w:r>
+        <w:rPr>
+          <w:rFonts w:ascii="Times New Roman" w:hAnsi="Times New Roman" w:cs="Times New Roman"/>
+          <w:bCs/>
+          <w:sz w:val="24"/>
+          <w:szCs w:val="24"/>
+        </w:rPr>
+        <w:t xml:space="preserve">] O. Gujral, </w:t>
       </w:r>
       <w:r>
         <w:rPr>
@@ -1308,7 +1171,16 @@
           <w:sz w:val="24"/>
           <w:szCs w:val="24"/>
         </w:rPr>
-        <w:t xml:space="preserve">*, M. Raghavan, J. Guttag, B. Berger, E. Pierson. </w:t>
+        <w:t>, B. Berger</w:t>
+      </w:r>
+      <w:r>
+        <w:rPr>
+          <w:rFonts w:ascii="Times New Roman" w:hAnsi="Times New Roman" w:cs="Times New Roman"/>
+          <w:bCs/>
+          <w:sz w:val="24"/>
+          <w:szCs w:val="24"/>
+        </w:rPr>
+        <w:t xml:space="preserve">. </w:t>
       </w:r>
       <w:r>
         <w:rPr>
@@ -1319,92 +1191,7 @@
           <w:sz w:val="24"/>
           <w:szCs w:val="24"/>
         </w:rPr>
-        <w:t>Evaluating multiple models using labeled and unlabeled data</w:t>
-      </w:r>
-      <w:r>
-        <w:rPr>
-          <w:rFonts w:ascii="Times New Roman" w:hAnsi="Times New Roman" w:cs="Times New Roman"/>
-          <w:bCs/>
-          <w:sz w:val="24"/>
-          <w:szCs w:val="24"/>
-        </w:rPr>
-        <w:t xml:space="preserve">. </w:t>
-      </w:r>
-      <w:proofErr w:type="spellStart"/>
-      <w:r>
-        <w:rPr>
-          <w:rFonts w:ascii="Times New Roman" w:hAnsi="Times New Roman" w:cs="Times New Roman"/>
-          <w:bCs/>
-          <w:sz w:val="24"/>
-          <w:szCs w:val="24"/>
-        </w:rPr>
-        <w:t>NeurIPS</w:t>
-      </w:r>
-      <w:proofErr w:type="spellEnd"/>
-      <w:r>
-        <w:rPr>
-          <w:rFonts w:ascii="Times New Roman" w:hAnsi="Times New Roman" w:cs="Times New Roman"/>
-          <w:bCs/>
-          <w:sz w:val="24"/>
-          <w:szCs w:val="24"/>
-        </w:rPr>
-        <w:t xml:space="preserve"> 2025</w:t>
-      </w:r>
-    </w:p>
-    <w:p>
-      <w:pPr>
-        <w:autoSpaceDE w:val="0"/>
-        <w:autoSpaceDN w:val="0"/>
-        <w:adjustRightInd w:val="0"/>
-        <w:spacing w:after="0" w:line="240" w:lineRule="auto"/>
-        <w:rPr>
-          <w:rFonts w:ascii="Times New Roman" w:hAnsi="Times New Roman" w:cs="Times New Roman"/>
-          <w:bCs/>
-          <w:sz w:val="24"/>
-          <w:szCs w:val="24"/>
-        </w:rPr>
-      </w:pPr>
-    </w:p>
-    <w:p>
-      <w:pPr>
-        <w:autoSpaceDE w:val="0"/>
-        <w:autoSpaceDN w:val="0"/>
-        <w:adjustRightInd w:val="0"/>
-        <w:spacing w:after="0" w:line="240" w:lineRule="auto"/>
-        <w:rPr>
-          <w:rFonts w:ascii="Times New Roman" w:hAnsi="Times New Roman" w:cs="Times New Roman"/>
-          <w:bCs/>
-          <w:sz w:val="24"/>
-          <w:szCs w:val="24"/>
-        </w:rPr>
-      </w:pPr>
-      <w:r>
-        <w:rPr>
-          <w:rFonts w:ascii="Times New Roman" w:hAnsi="Times New Roman" w:cs="Times New Roman"/>
-          <w:bCs/>
-          <w:sz w:val="24"/>
-          <w:szCs w:val="24"/>
-        </w:rPr>
-        <w:t xml:space="preserve">[p] </w:t>
-      </w:r>
-      <w:r>
-        <w:rPr>
-          <w:rFonts w:ascii="Times New Roman" w:hAnsi="Times New Roman" w:cs="Times New Roman"/>
-          <w:bCs/>
-          <w:sz w:val="24"/>
-          <w:szCs w:val="24"/>
-          <w:u w:val="single"/>
-        </w:rPr>
-        <w:t>S. Sadhuka</w:t>
-      </w:r>
-      <w:r>
-        <w:rPr>
-          <w:rFonts w:ascii="Times New Roman" w:hAnsi="Times New Roman" w:cs="Times New Roman"/>
-          <w:bCs/>
-          <w:sz w:val="24"/>
-          <w:szCs w:val="24"/>
-        </w:rPr>
-        <w:t xml:space="preserve">, S. Lin, B. Berger**. E. Pierson**. </w:t>
+        <w:t>Crosscoders enable the interpretable comparison of protein</w:t>
       </w:r>
       <w:r>
         <w:rPr>
@@ -1415,97 +1202,7 @@
           <w:sz w:val="24"/>
           <w:szCs w:val="24"/>
         </w:rPr>
-        <w:t>A Bayesian Model for Multi-stage Censoring</w:t>
-      </w:r>
-      <w:r>
-        <w:rPr>
-          <w:rFonts w:ascii="Times New Roman" w:hAnsi="Times New Roman" w:cs="Times New Roman"/>
-          <w:bCs/>
-          <w:sz w:val="24"/>
-          <w:szCs w:val="24"/>
-        </w:rPr>
-        <w:t xml:space="preserve">. </w:t>
-      </w:r>
-      <w:r>
-        <w:rPr>
-          <w:rFonts w:ascii="Times New Roman" w:hAnsi="Times New Roman" w:cs="Times New Roman"/>
-          <w:bCs/>
-          <w:sz w:val="24"/>
-          <w:szCs w:val="24"/>
-        </w:rPr>
-        <w:t>ML4H 2025</w:t>
-      </w:r>
-      <w:r>
-        <w:rPr>
-          <w:rFonts w:ascii="Times New Roman" w:hAnsi="Times New Roman" w:cs="Times New Roman"/>
-          <w:bCs/>
-          <w:sz w:val="24"/>
-          <w:szCs w:val="24"/>
-        </w:rPr>
-        <w:t xml:space="preserve"> (proceedings</w:t>
-      </w:r>
-      <w:r>
-        <w:rPr>
-          <w:rFonts w:ascii="Times New Roman" w:hAnsi="Times New Roman" w:cs="Times New Roman"/>
-          <w:bCs/>
-          <w:sz w:val="24"/>
-          <w:szCs w:val="24"/>
-        </w:rPr>
-        <w:t xml:space="preserve"> track</w:t>
-      </w:r>
-      <w:r>
-        <w:rPr>
-          <w:rFonts w:ascii="Times New Roman" w:hAnsi="Times New Roman" w:cs="Times New Roman"/>
-          <w:bCs/>
-          <w:sz w:val="24"/>
-          <w:szCs w:val="24"/>
-        </w:rPr>
-        <w:t>)</w:t>
-      </w:r>
-      <w:r>
-        <w:rPr>
-          <w:rFonts w:ascii="Times New Roman" w:hAnsi="Times New Roman" w:cs="Times New Roman"/>
-          <w:bCs/>
-          <w:sz w:val="24"/>
-          <w:szCs w:val="24"/>
-        </w:rPr>
-        <w:t xml:space="preserve">, also </w:t>
-      </w:r>
-      <w:r>
-        <w:rPr>
-          <w:rFonts w:ascii="Times New Roman" w:hAnsi="Times New Roman" w:cs="Times New Roman"/>
-          <w:b/>
-          <w:sz w:val="24"/>
-          <w:szCs w:val="24"/>
-        </w:rPr>
-        <w:t xml:space="preserve">spotlight presentation </w:t>
-      </w:r>
-      <w:r>
-        <w:rPr>
-          <w:rFonts w:ascii="Times New Roman" w:hAnsi="Times New Roman" w:cs="Times New Roman"/>
-          <w:b/>
-          <w:sz w:val="24"/>
-          <w:szCs w:val="24"/>
-        </w:rPr>
-        <w:t>at</w:t>
-      </w:r>
-      <w:r>
-        <w:rPr>
-          <w:rFonts w:ascii="Times New Roman" w:hAnsi="Times New Roman" w:cs="Times New Roman"/>
-          <w:b/>
-          <w:sz w:val="24"/>
-          <w:szCs w:val="24"/>
-        </w:rPr>
         <w:t xml:space="preserve"> </w:t>
-      </w:r>
-      <w:r>
-        <w:rPr>
-          <w:rFonts w:ascii="Times New Roman" w:hAnsi="Times New Roman" w:cs="Times New Roman"/>
-          <w:bCs/>
-          <w:sz w:val="24"/>
-          <w:szCs w:val="24"/>
-        </w:rPr>
-        <w:t>ML4H</w:t>
       </w:r>
       <w:r>
         <w:rPr>
@@ -1516,82 +1213,62 @@
           <w:sz w:val="24"/>
           <w:szCs w:val="24"/>
         </w:rPr>
-        <w:t xml:space="preserve"> </w:t>
-      </w:r>
-      <w:r>
-        <w:rPr>
-          <w:rFonts w:ascii="Times New Roman" w:hAnsi="Times New Roman" w:cs="Times New Roman"/>
-          <w:bCs/>
-          <w:sz w:val="24"/>
-          <w:szCs w:val="24"/>
-        </w:rPr>
-        <w:t>2024 (findings track)</w:t>
-      </w:r>
-    </w:p>
-    <w:p>
-      <w:pPr>
-        <w:autoSpaceDE w:val="0"/>
-        <w:autoSpaceDN w:val="0"/>
-        <w:adjustRightInd w:val="0"/>
-        <w:spacing w:after="0" w:line="240" w:lineRule="auto"/>
-        <w:rPr>
-          <w:rFonts w:ascii="Times New Roman" w:hAnsi="Times New Roman" w:cs="Times New Roman"/>
-          <w:bCs/>
-          <w:sz w:val="24"/>
-          <w:szCs w:val="24"/>
-        </w:rPr>
-      </w:pPr>
-    </w:p>
-    <w:p>
-      <w:pPr>
-        <w:autoSpaceDE w:val="0"/>
-        <w:autoSpaceDN w:val="0"/>
-        <w:adjustRightInd w:val="0"/>
-        <w:spacing w:after="0" w:line="240" w:lineRule="auto"/>
-        <w:rPr>
-          <w:rFonts w:ascii="Times New Roman" w:hAnsi="Times New Roman" w:cs="Times New Roman"/>
-          <w:bCs/>
-          <w:sz w:val="24"/>
-          <w:szCs w:val="24"/>
-        </w:rPr>
-      </w:pPr>
-      <w:r>
-        <w:rPr>
-          <w:rFonts w:ascii="Times New Roman" w:hAnsi="Times New Roman" w:cs="Times New Roman"/>
-          <w:bCs/>
-          <w:sz w:val="24"/>
-          <w:szCs w:val="24"/>
-        </w:rPr>
-        <w:t xml:space="preserve">[p] </w:t>
-      </w:r>
-      <w:r>
-        <w:rPr>
-          <w:rFonts w:ascii="Times New Roman" w:hAnsi="Times New Roman" w:cs="Times New Roman"/>
-          <w:bCs/>
-          <w:sz w:val="24"/>
-          <w:szCs w:val="24"/>
-        </w:rPr>
-        <w:t xml:space="preserve">H. Cho, D. Froelicher*, N. </w:t>
-      </w:r>
-      <w:proofErr w:type="spellStart"/>
-      <w:r>
-        <w:rPr>
-          <w:rFonts w:ascii="Times New Roman" w:hAnsi="Times New Roman" w:cs="Times New Roman"/>
-          <w:bCs/>
-          <w:sz w:val="24"/>
-          <w:szCs w:val="24"/>
-        </w:rPr>
-        <w:t>Dokmai</w:t>
-      </w:r>
-      <w:proofErr w:type="spellEnd"/>
-      <w:r>
-        <w:rPr>
-          <w:rFonts w:ascii="Times New Roman" w:hAnsi="Times New Roman" w:cs="Times New Roman"/>
-          <w:bCs/>
-          <w:sz w:val="24"/>
-          <w:szCs w:val="24"/>
-        </w:rPr>
-        <w:t xml:space="preserve">*, A. Nandi*, </w:t>
+        <w:t>language model layers</w:t>
+      </w:r>
+      <w:r>
+        <w:rPr>
+          <w:rFonts w:ascii="Times New Roman" w:hAnsi="Times New Roman" w:cs="Times New Roman"/>
+          <w:bCs/>
+          <w:sz w:val="24"/>
+          <w:szCs w:val="24"/>
+        </w:rPr>
+        <w:t xml:space="preserve">. </w:t>
+      </w:r>
+      <w:r>
+        <w:rPr>
+          <w:rFonts w:ascii="Times New Roman" w:hAnsi="Times New Roman" w:cs="Times New Roman"/>
+          <w:bCs/>
+          <w:sz w:val="24"/>
+          <w:szCs w:val="24"/>
+        </w:rPr>
+        <w:t>In progress.</w:t>
+      </w:r>
+    </w:p>
+    <w:p>
+      <w:pPr>
+        <w:autoSpaceDE w:val="0"/>
+        <w:autoSpaceDN w:val="0"/>
+        <w:adjustRightInd w:val="0"/>
+        <w:spacing w:after="0" w:line="240" w:lineRule="auto"/>
+        <w:rPr>
+          <w:rFonts w:ascii="Times New Roman" w:hAnsi="Times New Roman" w:cs="Times New Roman"/>
+          <w:bCs/>
+          <w:sz w:val="24"/>
+          <w:szCs w:val="24"/>
+        </w:rPr>
+      </w:pPr>
+    </w:p>
+    <w:p>
+      <w:pPr>
+        <w:autoSpaceDE w:val="0"/>
+        <w:autoSpaceDN w:val="0"/>
+        <w:adjustRightInd w:val="0"/>
+        <w:spacing w:after="0" w:line="240" w:lineRule="auto"/>
+        <w:rPr>
+          <w:rFonts w:ascii="Times New Roman" w:hAnsi="Times New Roman" w:cs="Times New Roman"/>
+          <w:bCs/>
+          <w:sz w:val="24"/>
+          <w:szCs w:val="24"/>
+        </w:rPr>
+      </w:pPr>
+      <w:r>
+        <w:rPr>
+          <w:rFonts w:ascii="Times New Roman" w:hAnsi="Times New Roman" w:cs="Times New Roman"/>
+          <w:bCs/>
+          <w:sz w:val="24"/>
+          <w:szCs w:val="24"/>
+        </w:rPr>
+        <w:t xml:space="preserve">[p] S. Balachandar, </w:t>
       </w:r>
       <w:r>
         <w:rPr>
@@ -1610,25 +1287,7 @@
           <w:sz w:val="24"/>
           <w:szCs w:val="24"/>
         </w:rPr>
-        <w:t xml:space="preserve">*, </w:t>
-      </w:r>
-      <w:r>
-        <w:rPr>
-          <w:rFonts w:ascii="Times New Roman" w:hAnsi="Times New Roman" w:cs="Times New Roman"/>
-          <w:bCs/>
-          <w:sz w:val="24"/>
-          <w:szCs w:val="24"/>
-        </w:rPr>
-        <w:t>M. Hong*, B. Berger</w:t>
-      </w:r>
-      <w:r>
-        <w:rPr>
-          <w:rFonts w:ascii="Times New Roman" w:hAnsi="Times New Roman" w:cs="Times New Roman"/>
-          <w:bCs/>
-          <w:sz w:val="24"/>
-          <w:szCs w:val="24"/>
-        </w:rPr>
-        <w:t xml:space="preserve">. </w:t>
+        <w:t xml:space="preserve">, B. Berger, E. Pierson, N. Garg. </w:t>
       </w:r>
       <w:r>
         <w:rPr>
@@ -1639,16 +1298,72 @@
           <w:sz w:val="24"/>
           <w:szCs w:val="24"/>
         </w:rPr>
-        <w:t>Privacy-Enhancing Technologies in Biomedical Data Science</w:t>
-      </w:r>
-      <w:r>
-        <w:rPr>
-          <w:rFonts w:ascii="Times New Roman" w:hAnsi="Times New Roman" w:cs="Times New Roman"/>
-          <w:bCs/>
-          <w:sz w:val="24"/>
-          <w:szCs w:val="24"/>
-        </w:rPr>
-        <w:t xml:space="preserve">. </w:t>
+        <w:t>Urban Incident Prediction with Graph Neural Networks: Integrating Government Ratings and Crowdsourced Reports</w:t>
+      </w:r>
+      <w:r>
+        <w:rPr>
+          <w:rFonts w:ascii="Times New Roman" w:hAnsi="Times New Roman" w:cs="Times New Roman"/>
+          <w:bCs/>
+          <w:sz w:val="24"/>
+          <w:szCs w:val="24"/>
+        </w:rPr>
+        <w:t>. AAAI 2026</w:t>
+      </w:r>
+    </w:p>
+    <w:p>
+      <w:pPr>
+        <w:autoSpaceDE w:val="0"/>
+        <w:autoSpaceDN w:val="0"/>
+        <w:adjustRightInd w:val="0"/>
+        <w:spacing w:after="0" w:line="240" w:lineRule="auto"/>
+        <w:rPr>
+          <w:rFonts w:ascii="Times New Roman" w:hAnsi="Times New Roman" w:cs="Times New Roman"/>
+          <w:bCs/>
+          <w:sz w:val="24"/>
+          <w:szCs w:val="24"/>
+        </w:rPr>
+      </w:pPr>
+    </w:p>
+    <w:p>
+      <w:pPr>
+        <w:autoSpaceDE w:val="0"/>
+        <w:autoSpaceDN w:val="0"/>
+        <w:adjustRightInd w:val="0"/>
+        <w:spacing w:after="0" w:line="240" w:lineRule="auto"/>
+        <w:rPr>
+          <w:rFonts w:ascii="Times New Roman" w:hAnsi="Times New Roman" w:cs="Times New Roman"/>
+          <w:bCs/>
+          <w:sz w:val="24"/>
+          <w:szCs w:val="24"/>
+        </w:rPr>
+      </w:pPr>
+      <w:r>
+        <w:rPr>
+          <w:rFonts w:ascii="Times New Roman" w:hAnsi="Times New Roman" w:cs="Times New Roman"/>
+          <w:bCs/>
+          <w:sz w:val="24"/>
+          <w:szCs w:val="24"/>
+        </w:rPr>
+        <w:t xml:space="preserve">[p] D. Shanmugam*, </w:t>
+      </w:r>
+      <w:r>
+        <w:rPr>
+          <w:rFonts w:ascii="Times New Roman" w:hAnsi="Times New Roman" w:cs="Times New Roman"/>
+          <w:bCs/>
+          <w:sz w:val="24"/>
+          <w:szCs w:val="24"/>
+          <w:u w:val="single"/>
+        </w:rPr>
+        <w:t>S. Sadhuka</w:t>
+      </w:r>
+      <w:r>
+        <w:rPr>
+          <w:rFonts w:ascii="Times New Roman" w:hAnsi="Times New Roman" w:cs="Times New Roman"/>
+          <w:bCs/>
+          <w:sz w:val="24"/>
+          <w:szCs w:val="24"/>
+        </w:rPr>
+        <w:t xml:space="preserve">*, M. Raghavan, J. Guttag, B. Berger, E. Pierson. </w:t>
       </w:r>
       <w:r>
         <w:rPr>
@@ -1659,16 +1374,16 @@
           <w:sz w:val="24"/>
           <w:szCs w:val="24"/>
         </w:rPr>
-        <w:t xml:space="preserve">Annual Reviews in Biomedical Data Science </w:t>
-      </w:r>
-      <w:r>
-        <w:rPr>
-          <w:rFonts w:ascii="Times New Roman" w:hAnsi="Times New Roman" w:cs="Times New Roman"/>
-          <w:bCs/>
-          <w:sz w:val="24"/>
-          <w:szCs w:val="24"/>
-        </w:rPr>
-        <w:t>2024</w:t>
+        <w:t>Evaluating multiple models using labeled and unlabeled data</w:t>
+      </w:r>
+      <w:r>
+        <w:rPr>
+          <w:rFonts w:ascii="Times New Roman" w:hAnsi="Times New Roman" w:cs="Times New Roman"/>
+          <w:bCs/>
+          <w:sz w:val="24"/>
+          <w:szCs w:val="24"/>
+        </w:rPr>
+        <w:t>. NeurIPS 2025</w:t>
       </w:r>
     </w:p>
     <w:p>
@@ -1724,25 +1439,7 @@
           <w:sz w:val="24"/>
           <w:szCs w:val="24"/>
         </w:rPr>
-        <w:t xml:space="preserve">, D. Fridman, </w:t>
-      </w:r>
-      <w:r>
-        <w:rPr>
-          <w:rFonts w:ascii="Times New Roman" w:hAnsi="Times New Roman" w:cs="Times New Roman"/>
-          <w:bCs/>
-          <w:sz w:val="24"/>
-          <w:szCs w:val="24"/>
-        </w:rPr>
-        <w:t>B. Berger, H. Cho</w:t>
-      </w:r>
-      <w:r>
-        <w:rPr>
-          <w:rFonts w:ascii="Times New Roman" w:hAnsi="Times New Roman" w:cs="Times New Roman"/>
-          <w:bCs/>
-          <w:sz w:val="24"/>
-          <w:szCs w:val="24"/>
-        </w:rPr>
-        <w:t xml:space="preserve">. </w:t>
+        <w:t xml:space="preserve">, S. Lin, B. Berger**. E. Pierson**. </w:t>
       </w:r>
       <w:r>
         <w:rPr>
@@ -1753,7 +1450,7 @@
           <w:sz w:val="24"/>
           <w:szCs w:val="24"/>
         </w:rPr>
-        <w:t>Assessing transcriptomic reidentification risks using discriminative sequence models</w:t>
+        <w:t>A Bayesian Model for Multi-stage Censoring</w:t>
       </w:r>
       <w:r>
         <w:rPr>
@@ -1763,6 +1460,87 @@
           <w:szCs w:val="24"/>
         </w:rPr>
         <w:t xml:space="preserve">. </w:t>
+      </w:r>
+      <w:r>
+        <w:rPr>
+          <w:rFonts w:ascii="Times New Roman" w:hAnsi="Times New Roman" w:cs="Times New Roman"/>
+          <w:bCs/>
+          <w:sz w:val="24"/>
+          <w:szCs w:val="24"/>
+        </w:rPr>
+        <w:t>ML4H 2025</w:t>
+      </w:r>
+      <w:r>
+        <w:rPr>
+          <w:rFonts w:ascii="Times New Roman" w:hAnsi="Times New Roman" w:cs="Times New Roman"/>
+          <w:bCs/>
+          <w:sz w:val="24"/>
+          <w:szCs w:val="24"/>
+        </w:rPr>
+        <w:t xml:space="preserve"> (proceedings</w:t>
+      </w:r>
+      <w:r>
+        <w:rPr>
+          <w:rFonts w:ascii="Times New Roman" w:hAnsi="Times New Roman" w:cs="Times New Roman"/>
+          <w:bCs/>
+          <w:sz w:val="24"/>
+          <w:szCs w:val="24"/>
+        </w:rPr>
+        <w:t xml:space="preserve"> track</w:t>
+      </w:r>
+      <w:r>
+        <w:rPr>
+          <w:rFonts w:ascii="Times New Roman" w:hAnsi="Times New Roman" w:cs="Times New Roman"/>
+          <w:bCs/>
+          <w:sz w:val="24"/>
+          <w:szCs w:val="24"/>
+        </w:rPr>
+        <w:t>)</w:t>
+      </w:r>
+      <w:r>
+        <w:rPr>
+          <w:rFonts w:ascii="Times New Roman" w:hAnsi="Times New Roman" w:cs="Times New Roman"/>
+          <w:bCs/>
+          <w:sz w:val="24"/>
+          <w:szCs w:val="24"/>
+        </w:rPr>
+        <w:t xml:space="preserve">, also </w:t>
+      </w:r>
+      <w:r>
+        <w:rPr>
+          <w:rFonts w:ascii="Times New Roman" w:hAnsi="Times New Roman" w:cs="Times New Roman"/>
+          <w:b/>
+          <w:sz w:val="24"/>
+          <w:szCs w:val="24"/>
+        </w:rPr>
+        <w:t xml:space="preserve">spotlight presentation </w:t>
+      </w:r>
+      <w:r>
+        <w:rPr>
+          <w:rFonts w:ascii="Times New Roman" w:hAnsi="Times New Roman" w:cs="Times New Roman"/>
+          <w:b/>
+          <w:sz w:val="24"/>
+          <w:szCs w:val="24"/>
+        </w:rPr>
+        <w:t>at</w:t>
+      </w:r>
+      <w:r>
+        <w:rPr>
+          <w:rFonts w:ascii="Times New Roman" w:hAnsi="Times New Roman" w:cs="Times New Roman"/>
+          <w:b/>
+          <w:sz w:val="24"/>
+          <w:szCs w:val="24"/>
+        </w:rPr>
+        <w:t xml:space="preserve"> </w:t>
+      </w:r>
+      <w:r>
+        <w:rPr>
+          <w:rFonts w:ascii="Times New Roman" w:hAnsi="Times New Roman" w:cs="Times New Roman"/>
+          <w:bCs/>
+          <w:sz w:val="24"/>
+          <w:szCs w:val="24"/>
+        </w:rPr>
+        <w:t>ML4H</w:t>
       </w:r>
       <w:r>
         <w:rPr>
@@ -1773,70 +1551,100 @@
           <w:sz w:val="24"/>
           <w:szCs w:val="24"/>
         </w:rPr>
-        <w:t>Genome Research</w:t>
-      </w:r>
-      <w:r>
-        <w:rPr>
-          <w:rFonts w:ascii="Times New Roman" w:hAnsi="Times New Roman" w:cs="Times New Roman"/>
-          <w:bCs/>
-          <w:sz w:val="24"/>
-          <w:szCs w:val="24"/>
-        </w:rPr>
-        <w:t xml:space="preserve"> 2023</w:t>
-      </w:r>
-      <w:r>
-        <w:rPr>
-          <w:rFonts w:ascii="Times New Roman" w:hAnsi="Times New Roman" w:cs="Times New Roman"/>
-          <w:bCs/>
-          <w:sz w:val="24"/>
-          <w:szCs w:val="24"/>
-        </w:rPr>
-        <w:t xml:space="preserve">; </w:t>
-      </w:r>
-      <w:r>
-        <w:rPr>
-          <w:rFonts w:ascii="Times New Roman" w:hAnsi="Times New Roman" w:cs="Times New Roman"/>
-          <w:b/>
-          <w:sz w:val="24"/>
-          <w:szCs w:val="24"/>
-        </w:rPr>
-        <w:t>oral presentation</w:t>
-      </w:r>
-      <w:r>
-        <w:rPr>
-          <w:rFonts w:ascii="Times New Roman" w:hAnsi="Times New Roman" w:cs="Times New Roman"/>
-          <w:bCs/>
-          <w:sz w:val="24"/>
-          <w:szCs w:val="24"/>
-        </w:rPr>
         <w:t xml:space="preserve"> </w:t>
       </w:r>
       <w:r>
         <w:rPr>
           <w:rFonts w:ascii="Times New Roman" w:hAnsi="Times New Roman" w:cs="Times New Roman"/>
-          <w:b/>
-          <w:sz w:val="24"/>
-          <w:szCs w:val="24"/>
-        </w:rPr>
-        <w:t>at</w:t>
-      </w:r>
-      <w:r>
-        <w:rPr>
-          <w:rFonts w:ascii="Times New Roman" w:hAnsi="Times New Roman" w:cs="Times New Roman"/>
-          <w:b/>
-          <w:sz w:val="24"/>
-          <w:szCs w:val="24"/>
-        </w:rPr>
-        <w:t xml:space="preserve"> </w:t>
-      </w:r>
-      <w:r>
-        <w:rPr>
-          <w:rFonts w:ascii="Times New Roman" w:hAnsi="Times New Roman" w:cs="Times New Roman"/>
-          <w:bCs/>
-          <w:sz w:val="24"/>
-          <w:szCs w:val="24"/>
-        </w:rPr>
-        <w:t>RECOMB</w:t>
+          <w:bCs/>
+          <w:sz w:val="24"/>
+          <w:szCs w:val="24"/>
+        </w:rPr>
+        <w:t>2024 (findings track)</w:t>
+      </w:r>
+    </w:p>
+    <w:p>
+      <w:pPr>
+        <w:autoSpaceDE w:val="0"/>
+        <w:autoSpaceDN w:val="0"/>
+        <w:adjustRightInd w:val="0"/>
+        <w:spacing w:after="0" w:line="240" w:lineRule="auto"/>
+        <w:rPr>
+          <w:rFonts w:ascii="Times New Roman" w:hAnsi="Times New Roman" w:cs="Times New Roman"/>
+          <w:bCs/>
+          <w:sz w:val="24"/>
+          <w:szCs w:val="24"/>
+        </w:rPr>
+      </w:pPr>
+    </w:p>
+    <w:p>
+      <w:pPr>
+        <w:autoSpaceDE w:val="0"/>
+        <w:autoSpaceDN w:val="0"/>
+        <w:adjustRightInd w:val="0"/>
+        <w:spacing w:after="0" w:line="240" w:lineRule="auto"/>
+        <w:rPr>
+          <w:rFonts w:ascii="Times New Roman" w:hAnsi="Times New Roman" w:cs="Times New Roman"/>
+          <w:bCs/>
+          <w:sz w:val="24"/>
+          <w:szCs w:val="24"/>
+        </w:rPr>
+      </w:pPr>
+      <w:r>
+        <w:rPr>
+          <w:rFonts w:ascii="Times New Roman" w:hAnsi="Times New Roman" w:cs="Times New Roman"/>
+          <w:bCs/>
+          <w:sz w:val="24"/>
+          <w:szCs w:val="24"/>
+        </w:rPr>
+        <w:lastRenderedPageBreak/>
+        <w:t xml:space="preserve">[p] </w:t>
+      </w:r>
+      <w:r>
+        <w:rPr>
+          <w:rFonts w:ascii="Times New Roman" w:hAnsi="Times New Roman" w:cs="Times New Roman"/>
+          <w:bCs/>
+          <w:sz w:val="24"/>
+          <w:szCs w:val="24"/>
+        </w:rPr>
+        <w:t xml:space="preserve">H. Cho, D. Froelicher*, N. Dokmai*, A. Nandi*, </w:t>
+      </w:r>
+      <w:r>
+        <w:rPr>
+          <w:rFonts w:ascii="Times New Roman" w:hAnsi="Times New Roman" w:cs="Times New Roman"/>
+          <w:bCs/>
+          <w:sz w:val="24"/>
+          <w:szCs w:val="24"/>
+          <w:u w:val="single"/>
+        </w:rPr>
+        <w:t>S. Sadhuka</w:t>
+      </w:r>
+      <w:r>
+        <w:rPr>
+          <w:rFonts w:ascii="Times New Roman" w:hAnsi="Times New Roman" w:cs="Times New Roman"/>
+          <w:bCs/>
+          <w:sz w:val="24"/>
+          <w:szCs w:val="24"/>
+        </w:rPr>
+        <w:t xml:space="preserve">*, </w:t>
+      </w:r>
+      <w:r>
+        <w:rPr>
+          <w:rFonts w:ascii="Times New Roman" w:hAnsi="Times New Roman" w:cs="Times New Roman"/>
+          <w:bCs/>
+          <w:sz w:val="24"/>
+          <w:szCs w:val="24"/>
+        </w:rPr>
+        <w:t>M. Hong*, B. Berger</w:t>
+      </w:r>
+      <w:r>
+        <w:rPr>
+          <w:rFonts w:ascii="Times New Roman" w:hAnsi="Times New Roman" w:cs="Times New Roman"/>
+          <w:bCs/>
+          <w:sz w:val="24"/>
+          <w:szCs w:val="24"/>
+        </w:rPr>
+        <w:t xml:space="preserve">. </w:t>
       </w:r>
       <w:r>
         <w:rPr>
@@ -1847,81 +1655,16 @@
           <w:sz w:val="24"/>
           <w:szCs w:val="24"/>
         </w:rPr>
-        <w:t xml:space="preserve"> </w:t>
-      </w:r>
-      <w:r>
-        <w:rPr>
-          <w:rFonts w:ascii="Times New Roman" w:hAnsi="Times New Roman" w:cs="Times New Roman"/>
-          <w:bCs/>
-          <w:sz w:val="24"/>
-          <w:szCs w:val="24"/>
-        </w:rPr>
-        <w:t>2023</w:t>
-      </w:r>
-    </w:p>
-    <w:p>
-      <w:pPr>
-        <w:autoSpaceDE w:val="0"/>
-        <w:autoSpaceDN w:val="0"/>
-        <w:adjustRightInd w:val="0"/>
-        <w:spacing w:after="0" w:line="240" w:lineRule="auto"/>
-        <w:rPr>
-          <w:rFonts w:ascii="Times New Roman" w:hAnsi="Times New Roman" w:cs="Times New Roman"/>
-          <w:bCs/>
-          <w:sz w:val="24"/>
-          <w:szCs w:val="24"/>
-        </w:rPr>
-      </w:pPr>
-    </w:p>
-    <w:p>
-      <w:pPr>
-        <w:autoSpaceDE w:val="0"/>
-        <w:autoSpaceDN w:val="0"/>
-        <w:adjustRightInd w:val="0"/>
-        <w:spacing w:after="0" w:line="240" w:lineRule="auto"/>
-        <w:rPr>
-          <w:rFonts w:ascii="Times New Roman" w:hAnsi="Times New Roman" w:cs="Times New Roman"/>
-          <w:bCs/>
-          <w:sz w:val="24"/>
-          <w:szCs w:val="24"/>
-        </w:rPr>
-      </w:pPr>
-      <w:r>
-        <w:rPr>
-          <w:rFonts w:ascii="Times New Roman" w:hAnsi="Times New Roman" w:cs="Times New Roman"/>
-          <w:bCs/>
-          <w:sz w:val="24"/>
-          <w:szCs w:val="24"/>
-        </w:rPr>
-        <w:t xml:space="preserve">[p] </w:t>
-      </w:r>
-      <w:r>
-        <w:rPr>
-          <w:rFonts w:ascii="Times New Roman" w:hAnsi="Times New Roman" w:cs="Times New Roman"/>
-          <w:bCs/>
-          <w:sz w:val="24"/>
-          <w:szCs w:val="24"/>
-        </w:rPr>
-        <w:t xml:space="preserve">H. Pirie, </w:t>
-      </w:r>
-      <w:r>
-        <w:rPr>
-          <w:rFonts w:ascii="Times New Roman" w:hAnsi="Times New Roman" w:cs="Times New Roman"/>
-          <w:bCs/>
-          <w:sz w:val="24"/>
-          <w:szCs w:val="24"/>
-          <w:u w:val="single"/>
-        </w:rPr>
-        <w:t>S. Sadhuka</w:t>
-      </w:r>
-      <w:r>
-        <w:rPr>
-          <w:rFonts w:ascii="Times New Roman" w:hAnsi="Times New Roman" w:cs="Times New Roman"/>
-          <w:bCs/>
-          <w:sz w:val="24"/>
-          <w:szCs w:val="24"/>
-        </w:rPr>
-        <w:t xml:space="preserve">, J. Wang, R. Andrei, J. Hoffman. </w:t>
+        <w:t>Privacy-Enhancing Technologies in Biomedical Data Science</w:t>
+      </w:r>
+      <w:r>
+        <w:rPr>
+          <w:rFonts w:ascii="Times New Roman" w:hAnsi="Times New Roman" w:cs="Times New Roman"/>
+          <w:bCs/>
+          <w:sz w:val="24"/>
+          <w:szCs w:val="24"/>
+        </w:rPr>
+        <w:t xml:space="preserve">. </w:t>
       </w:r>
       <w:r>
         <w:rPr>
@@ -1932,9 +1675,91 @@
           <w:sz w:val="24"/>
           <w:szCs w:val="24"/>
         </w:rPr>
-        <w:t xml:space="preserve">Topological </w:t>
-      </w:r>
-      <w:proofErr w:type="spellStart"/>
+        <w:t xml:space="preserve">Annual Reviews in Biomedical Data Science </w:t>
+      </w:r>
+      <w:r>
+        <w:rPr>
+          <w:rFonts w:ascii="Times New Roman" w:hAnsi="Times New Roman" w:cs="Times New Roman"/>
+          <w:bCs/>
+          <w:sz w:val="24"/>
+          <w:szCs w:val="24"/>
+        </w:rPr>
+        <w:t>2024</w:t>
+      </w:r>
+    </w:p>
+    <w:p>
+      <w:pPr>
+        <w:autoSpaceDE w:val="0"/>
+        <w:autoSpaceDN w:val="0"/>
+        <w:adjustRightInd w:val="0"/>
+        <w:spacing w:after="0" w:line="240" w:lineRule="auto"/>
+        <w:rPr>
+          <w:rFonts w:ascii="Times New Roman" w:hAnsi="Times New Roman" w:cs="Times New Roman"/>
+          <w:bCs/>
+          <w:sz w:val="24"/>
+          <w:szCs w:val="24"/>
+        </w:rPr>
+      </w:pPr>
+    </w:p>
+    <w:p>
+      <w:pPr>
+        <w:autoSpaceDE w:val="0"/>
+        <w:autoSpaceDN w:val="0"/>
+        <w:adjustRightInd w:val="0"/>
+        <w:spacing w:after="0" w:line="240" w:lineRule="auto"/>
+        <w:rPr>
+          <w:rFonts w:ascii="Times New Roman" w:hAnsi="Times New Roman" w:cs="Times New Roman"/>
+          <w:bCs/>
+          <w:sz w:val="24"/>
+          <w:szCs w:val="24"/>
+        </w:rPr>
+      </w:pPr>
+      <w:r>
+        <w:rPr>
+          <w:rFonts w:ascii="Times New Roman" w:hAnsi="Times New Roman" w:cs="Times New Roman"/>
+          <w:bCs/>
+          <w:sz w:val="24"/>
+          <w:szCs w:val="24"/>
+        </w:rPr>
+        <w:t xml:space="preserve">[p] </w:t>
+      </w:r>
+      <w:r>
+        <w:rPr>
+          <w:rFonts w:ascii="Times New Roman" w:hAnsi="Times New Roman" w:cs="Times New Roman"/>
+          <w:bCs/>
+          <w:sz w:val="24"/>
+          <w:szCs w:val="24"/>
+          <w:u w:val="single"/>
+        </w:rPr>
+        <w:t>S. Sadhuka</w:t>
+      </w:r>
+      <w:r>
+        <w:rPr>
+          <w:rFonts w:ascii="Times New Roman" w:hAnsi="Times New Roman" w:cs="Times New Roman"/>
+          <w:bCs/>
+          <w:sz w:val="24"/>
+          <w:szCs w:val="24"/>
+        </w:rPr>
+        <w:t xml:space="preserve">, D. Fridman, </w:t>
+      </w:r>
+      <w:r>
+        <w:rPr>
+          <w:rFonts w:ascii="Times New Roman" w:hAnsi="Times New Roman" w:cs="Times New Roman"/>
+          <w:bCs/>
+          <w:sz w:val="24"/>
+          <w:szCs w:val="24"/>
+        </w:rPr>
+        <w:t>B. Berger, H. Cho</w:t>
+      </w:r>
+      <w:r>
+        <w:rPr>
+          <w:rFonts w:ascii="Times New Roman" w:hAnsi="Times New Roman" w:cs="Times New Roman"/>
+          <w:bCs/>
+          <w:sz w:val="24"/>
+          <w:szCs w:val="24"/>
+        </w:rPr>
+        <w:t xml:space="preserve">. </w:t>
+      </w:r>
       <w:r>
         <w:rPr>
           <w:rFonts w:ascii="Times New Roman" w:hAnsi="Times New Roman" w:cs="Times New Roman"/>
@@ -1944,7 +1769,16 @@
           <w:sz w:val="24"/>
           <w:szCs w:val="24"/>
         </w:rPr>
-        <w:t>p</w:t>
+        <w:t>Assessing transcriptomic reidentification risks using discriminative sequence models</w:t>
+      </w:r>
+      <w:r>
+        <w:rPr>
+          <w:rFonts w:ascii="Times New Roman" w:hAnsi="Times New Roman" w:cs="Times New Roman"/>
+          <w:bCs/>
+          <w:sz w:val="24"/>
+          <w:szCs w:val="24"/>
+        </w:rPr>
+        <w:t xml:space="preserve">. </w:t>
       </w:r>
       <w:r>
         <w:rPr>
@@ -1955,9 +1789,71 @@
           <w:sz w:val="24"/>
           <w:szCs w:val="24"/>
         </w:rPr>
-        <w:t>hononic</w:t>
-      </w:r>
-      <w:proofErr w:type="spellEnd"/>
+        <w:t>Genome Research</w:t>
+      </w:r>
+      <w:r>
+        <w:rPr>
+          <w:rFonts w:ascii="Times New Roman" w:hAnsi="Times New Roman" w:cs="Times New Roman"/>
+          <w:bCs/>
+          <w:sz w:val="24"/>
+          <w:szCs w:val="24"/>
+        </w:rPr>
+        <w:t xml:space="preserve"> 2023</w:t>
+      </w:r>
+      <w:r>
+        <w:rPr>
+          <w:rFonts w:ascii="Times New Roman" w:hAnsi="Times New Roman" w:cs="Times New Roman"/>
+          <w:bCs/>
+          <w:sz w:val="24"/>
+          <w:szCs w:val="24"/>
+        </w:rPr>
+        <w:t xml:space="preserve">; </w:t>
+      </w:r>
+      <w:r>
+        <w:rPr>
+          <w:rFonts w:ascii="Times New Roman" w:hAnsi="Times New Roman" w:cs="Times New Roman"/>
+          <w:b/>
+          <w:sz w:val="24"/>
+          <w:szCs w:val="24"/>
+        </w:rPr>
+        <w:t>oral presentation</w:t>
+      </w:r>
+      <w:r>
+        <w:rPr>
+          <w:rFonts w:ascii="Times New Roman" w:hAnsi="Times New Roman" w:cs="Times New Roman"/>
+          <w:bCs/>
+          <w:sz w:val="24"/>
+          <w:szCs w:val="24"/>
+        </w:rPr>
+        <w:t xml:space="preserve"> </w:t>
+      </w:r>
+      <w:r>
+        <w:rPr>
+          <w:rFonts w:ascii="Times New Roman" w:hAnsi="Times New Roman" w:cs="Times New Roman"/>
+          <w:b/>
+          <w:sz w:val="24"/>
+          <w:szCs w:val="24"/>
+        </w:rPr>
+        <w:t>at</w:t>
+      </w:r>
+      <w:r>
+        <w:rPr>
+          <w:rFonts w:ascii="Times New Roman" w:hAnsi="Times New Roman" w:cs="Times New Roman"/>
+          <w:b/>
+          <w:sz w:val="24"/>
+          <w:szCs w:val="24"/>
+        </w:rPr>
+        <w:t xml:space="preserve"> </w:t>
+      </w:r>
+      <w:r>
+        <w:rPr>
+          <w:rFonts w:ascii="Times New Roman" w:hAnsi="Times New Roman" w:cs="Times New Roman"/>
+          <w:bCs/>
+          <w:sz w:val="24"/>
+          <w:szCs w:val="24"/>
+        </w:rPr>
+        <w:t>RECOMB</w:t>
+      </w:r>
       <w:r>
         <w:rPr>
           <w:rFonts w:ascii="Times New Roman" w:hAnsi="Times New Roman" w:cs="Times New Roman"/>
@@ -1968,6 +1864,113 @@
           <w:szCs w:val="24"/>
         </w:rPr>
         <w:t xml:space="preserve"> </w:t>
+      </w:r>
+      <w:r>
+        <w:rPr>
+          <w:rFonts w:ascii="Times New Roman" w:hAnsi="Times New Roman" w:cs="Times New Roman"/>
+          <w:bCs/>
+          <w:sz w:val="24"/>
+          <w:szCs w:val="24"/>
+        </w:rPr>
+        <w:t>2023</w:t>
+      </w:r>
+    </w:p>
+    <w:p>
+      <w:pPr>
+        <w:autoSpaceDE w:val="0"/>
+        <w:autoSpaceDN w:val="0"/>
+        <w:adjustRightInd w:val="0"/>
+        <w:spacing w:after="0" w:line="240" w:lineRule="auto"/>
+        <w:rPr>
+          <w:rFonts w:ascii="Times New Roman" w:hAnsi="Times New Roman" w:cs="Times New Roman"/>
+          <w:bCs/>
+          <w:sz w:val="24"/>
+          <w:szCs w:val="24"/>
+        </w:rPr>
+      </w:pPr>
+    </w:p>
+    <w:p>
+      <w:pPr>
+        <w:autoSpaceDE w:val="0"/>
+        <w:autoSpaceDN w:val="0"/>
+        <w:adjustRightInd w:val="0"/>
+        <w:spacing w:after="0" w:line="240" w:lineRule="auto"/>
+        <w:rPr>
+          <w:rFonts w:ascii="Times New Roman" w:hAnsi="Times New Roman" w:cs="Times New Roman"/>
+          <w:bCs/>
+          <w:sz w:val="24"/>
+          <w:szCs w:val="24"/>
+        </w:rPr>
+      </w:pPr>
+      <w:r>
+        <w:rPr>
+          <w:rFonts w:ascii="Times New Roman" w:hAnsi="Times New Roman" w:cs="Times New Roman"/>
+          <w:bCs/>
+          <w:sz w:val="24"/>
+          <w:szCs w:val="24"/>
+        </w:rPr>
+        <w:t xml:space="preserve">[p] </w:t>
+      </w:r>
+      <w:r>
+        <w:rPr>
+          <w:rFonts w:ascii="Times New Roman" w:hAnsi="Times New Roman" w:cs="Times New Roman"/>
+          <w:bCs/>
+          <w:sz w:val="24"/>
+          <w:szCs w:val="24"/>
+        </w:rPr>
+        <w:t xml:space="preserve">H. Pirie, </w:t>
+      </w:r>
+      <w:r>
+        <w:rPr>
+          <w:rFonts w:ascii="Times New Roman" w:hAnsi="Times New Roman" w:cs="Times New Roman"/>
+          <w:bCs/>
+          <w:sz w:val="24"/>
+          <w:szCs w:val="24"/>
+          <w:u w:val="single"/>
+        </w:rPr>
+        <w:t>S. Sadhuka</w:t>
+      </w:r>
+      <w:r>
+        <w:rPr>
+          <w:rFonts w:ascii="Times New Roman" w:hAnsi="Times New Roman" w:cs="Times New Roman"/>
+          <w:bCs/>
+          <w:sz w:val="24"/>
+          <w:szCs w:val="24"/>
+        </w:rPr>
+        <w:t xml:space="preserve">, J. Wang, R. Andrei, J. Hoffman. </w:t>
+      </w:r>
+      <w:r>
+        <w:rPr>
+          <w:rFonts w:ascii="Times New Roman" w:hAnsi="Times New Roman" w:cs="Times New Roman"/>
+          <w:bCs/>
+          <w:i/>
+          <w:iCs/>
+          <w:sz w:val="24"/>
+          <w:szCs w:val="24"/>
+        </w:rPr>
+        <w:t xml:space="preserve">Topological </w:t>
+      </w:r>
+      <w:r>
+        <w:rPr>
+          <w:rFonts w:ascii="Times New Roman" w:hAnsi="Times New Roman" w:cs="Times New Roman"/>
+          <w:bCs/>
+          <w:i/>
+          <w:iCs/>
+          <w:sz w:val="24"/>
+          <w:szCs w:val="24"/>
+        </w:rPr>
+        <w:t>p</w:t>
+      </w:r>
+      <w:r>
+        <w:rPr>
+          <w:rFonts w:ascii="Times New Roman" w:hAnsi="Times New Roman" w:cs="Times New Roman"/>
+          <w:bCs/>
+          <w:i/>
+          <w:iCs/>
+          <w:sz w:val="24"/>
+          <w:szCs w:val="24"/>
+        </w:rPr>
+        <w:t xml:space="preserve">hononic </w:t>
       </w:r>
       <w:r>
         <w:rPr>
@@ -2077,7 +2080,7 @@
         </w:rPr>
         <w:t xml:space="preserve">Press: </w:t>
       </w:r>
-      <w:hyperlink r:id="rId9" w:history="1">
+      <w:hyperlink r:id="rId10" w:history="1">
         <w:r>
           <w:rPr>
             <w:rStyle w:val="Hyperlink"/>
@@ -2102,7 +2105,7 @@
         </w:rPr>
         <w:t xml:space="preserve">, </w:t>
       </w:r>
-      <w:hyperlink r:id="rId10" w:history="1">
+      <w:hyperlink r:id="rId11" w:history="1">
         <w:r>
           <w:rPr>
             <w:rStyle w:val="Hyperlink"/>
@@ -2127,7 +2130,7 @@
         </w:rPr>
         <w:t xml:space="preserve">, </w:t>
       </w:r>
-      <w:hyperlink r:id="rId11" w:history="1">
+      <w:hyperlink r:id="rId12" w:history="1">
         <w:r>
           <w:rPr>
             <w:rStyle w:val="Hyperlink"/>
@@ -2152,8 +2155,7 @@
         </w:rPr>
         <w:t xml:space="preserve">, </w:t>
       </w:r>
-      <w:hyperlink r:id="rId12" w:history="1">
-        <w:proofErr w:type="spellStart"/>
+      <w:hyperlink r:id="rId13" w:history="1">
         <w:r>
           <w:rPr>
             <w:rStyle w:val="Hyperlink"/>
@@ -2166,7 +2168,6 @@
           </w:rPr>
           <w:t>Hackaday</w:t>
         </w:r>
-        <w:proofErr w:type="spellEnd"/>
       </w:hyperlink>
     </w:p>
     <w:p>
@@ -2231,27 +2232,7 @@
           <w:sz w:val="24"/>
           <w:szCs w:val="24"/>
         </w:rPr>
-        <w:t xml:space="preserve">, R. Cui, C. </w:t>
-      </w:r>
-      <w:proofErr w:type="spellStart"/>
-      <w:r>
-        <w:rPr>
-          <w:rFonts w:ascii="Times New Roman" w:hAnsi="Times New Roman" w:cs="Times New Roman"/>
-          <w:bCs/>
-          <w:sz w:val="24"/>
-          <w:szCs w:val="24"/>
-        </w:rPr>
-        <w:t>Albors</w:t>
-      </w:r>
-      <w:proofErr w:type="spellEnd"/>
-      <w:r>
-        <w:rPr>
-          <w:rFonts w:ascii="Times New Roman" w:hAnsi="Times New Roman" w:cs="Times New Roman"/>
-          <w:bCs/>
-          <w:sz w:val="24"/>
-          <w:szCs w:val="24"/>
-        </w:rPr>
-        <w:t xml:space="preserve">, N. Cheng, Y. Okada, Biobank Japan Project, F. Aguet, K. Ardlie, D. MacArthur, H. Finucane. </w:t>
+        <w:t xml:space="preserve">, R. Cui, C. Albors, N. Cheng, Y. Okada, Biobank Japan Project, F. Aguet, K. Ardlie, D. MacArthur, H. Finucane. </w:t>
       </w:r>
       <w:r>
         <w:rPr>
@@ -2262,55 +2243,7 @@
           <w:sz w:val="24"/>
           <w:szCs w:val="24"/>
         </w:rPr>
-        <w:t>Leveraging supervised learning for functionally informed fine-mapping of cis-</w:t>
-      </w:r>
-      <w:proofErr w:type="spellStart"/>
-      <w:r>
-        <w:rPr>
-          <w:rFonts w:ascii="Times New Roman" w:hAnsi="Times New Roman" w:cs="Times New Roman"/>
-          <w:bCs/>
-          <w:i/>
-          <w:iCs/>
-          <w:sz w:val="24"/>
-          <w:szCs w:val="24"/>
-        </w:rPr>
-        <w:t>eQTLs</w:t>
-      </w:r>
-      <w:proofErr w:type="spellEnd"/>
-      <w:r>
-        <w:rPr>
-          <w:rFonts w:ascii="Times New Roman" w:hAnsi="Times New Roman" w:cs="Times New Roman"/>
-          <w:bCs/>
-          <w:i/>
-          <w:iCs/>
-          <w:sz w:val="24"/>
-          <w:szCs w:val="24"/>
-        </w:rPr>
-        <w:t xml:space="preserve"> identifies an additional 20,913 putative causal </w:t>
-      </w:r>
-      <w:proofErr w:type="spellStart"/>
-      <w:r>
-        <w:rPr>
-          <w:rFonts w:ascii="Times New Roman" w:hAnsi="Times New Roman" w:cs="Times New Roman"/>
-          <w:bCs/>
-          <w:i/>
-          <w:iCs/>
-          <w:sz w:val="24"/>
-          <w:szCs w:val="24"/>
-        </w:rPr>
-        <w:t>eQTLs</w:t>
-      </w:r>
-      <w:proofErr w:type="spellEnd"/>
-      <w:r>
-        <w:rPr>
-          <w:rFonts w:ascii="Times New Roman" w:hAnsi="Times New Roman" w:cs="Times New Roman"/>
-          <w:bCs/>
-          <w:i/>
-          <w:iCs/>
-          <w:sz w:val="24"/>
-          <w:szCs w:val="24"/>
-        </w:rPr>
-        <w:t>. Nature Communications</w:t>
+        <w:t>Leveraging supervised learning for functionally informed fine-mapping of cis-eQTLs identifies an additional 20,913 putative causal eQTLs. Nature Communications</w:t>
       </w:r>
       <w:r>
         <w:rPr>
@@ -2418,243 +2351,6 @@
           <w:szCs w:val="24"/>
         </w:rPr>
         <w:t>Rational Intelligence Seminar Series</w:t>
-      </w:r>
-      <w:r>
-        <w:rPr>
-          <w:rFonts w:ascii="Times New Roman" w:hAnsi="Times New Roman" w:cs="Times New Roman"/>
-          <w:sz w:val="24"/>
-          <w:szCs w:val="24"/>
-        </w:rPr>
-        <w:t xml:space="preserve"> [</w:t>
-      </w:r>
-      <w:hyperlink r:id="rId13" w:history="1">
-        <w:r>
-          <w:rPr>
-            <w:rStyle w:val="Hyperlink"/>
-            <w:rFonts w:ascii="Times New Roman" w:hAnsi="Times New Roman" w:cs="Times New Roman"/>
-            <w:sz w:val="24"/>
-            <w:szCs w:val="24"/>
-          </w:rPr>
-          <w:t>YouTube</w:t>
-        </w:r>
-      </w:hyperlink>
-      <w:r>
-        <w:rPr>
-          <w:rFonts w:ascii="Times New Roman" w:hAnsi="Times New Roman" w:cs="Times New Roman"/>
-          <w:sz w:val="24"/>
-          <w:szCs w:val="24"/>
-        </w:rPr>
-        <w:t>]</w:t>
-      </w:r>
-      <w:r>
-        <w:rPr>
-          <w:rFonts w:ascii="Times New Roman" w:hAnsi="Times New Roman" w:cs="Times New Roman"/>
-          <w:sz w:val="24"/>
-          <w:szCs w:val="24"/>
-        </w:rPr>
-        <w:tab/>
-      </w:r>
-      <w:r>
-        <w:rPr>
-          <w:rFonts w:ascii="Times New Roman" w:hAnsi="Times New Roman" w:cs="Times New Roman"/>
-          <w:sz w:val="24"/>
-          <w:szCs w:val="24"/>
-        </w:rPr>
-        <w:t>2026</w:t>
-      </w:r>
-    </w:p>
-    <w:p>
-      <w:pPr>
-        <w:tabs>
-          <w:tab w:val="right" w:pos="9360"/>
-        </w:tabs>
-        <w:autoSpaceDE w:val="0"/>
-        <w:autoSpaceDN w:val="0"/>
-        <w:adjustRightInd w:val="0"/>
-        <w:spacing w:after="0" w:line="240" w:lineRule="auto"/>
-        <w:rPr>
-          <w:rFonts w:ascii="Times New Roman" w:hAnsi="Times New Roman" w:cs="Times New Roman"/>
-          <w:sz w:val="24"/>
-          <w:szCs w:val="24"/>
-        </w:rPr>
-      </w:pPr>
-      <w:r>
-        <w:rPr>
-          <w:rFonts w:ascii="Times New Roman" w:hAnsi="Times New Roman" w:cs="Times New Roman"/>
-          <w:sz w:val="24"/>
-          <w:szCs w:val="24"/>
-        </w:rPr>
-        <w:t xml:space="preserve">MIT, Algorithms Coffee                                                                                                           </w:t>
-      </w:r>
-      <w:r>
-        <w:rPr>
-          <w:rFonts w:ascii="Times New Roman" w:hAnsi="Times New Roman" w:cs="Times New Roman"/>
-          <w:sz w:val="24"/>
-          <w:szCs w:val="24"/>
-        </w:rPr>
-        <w:tab/>
-        <w:t>2026</w:t>
-      </w:r>
-    </w:p>
-    <w:p>
-      <w:pPr>
-        <w:tabs>
-          <w:tab w:val="right" w:pos="9360"/>
-        </w:tabs>
-        <w:autoSpaceDE w:val="0"/>
-        <w:autoSpaceDN w:val="0"/>
-        <w:adjustRightInd w:val="0"/>
-        <w:spacing w:after="0" w:line="240" w:lineRule="auto"/>
-        <w:rPr>
-          <w:rFonts w:ascii="Times New Roman" w:hAnsi="Times New Roman" w:cs="Times New Roman"/>
-          <w:sz w:val="24"/>
-          <w:szCs w:val="24"/>
-        </w:rPr>
-      </w:pPr>
-    </w:p>
-    <w:p>
-      <w:pPr>
-        <w:tabs>
-          <w:tab w:val="right" w:pos="9360"/>
-        </w:tabs>
-        <w:autoSpaceDE w:val="0"/>
-        <w:autoSpaceDN w:val="0"/>
-        <w:adjustRightInd w:val="0"/>
-        <w:spacing w:after="0" w:line="240" w:lineRule="auto"/>
-        <w:rPr>
-          <w:rFonts w:ascii="Times New Roman" w:hAnsi="Times New Roman" w:cs="Times New Roman"/>
-          <w:b/>
-          <w:bCs/>
-          <w:sz w:val="24"/>
-          <w:szCs w:val="24"/>
-        </w:rPr>
-      </w:pPr>
-      <w:r>
-        <w:rPr>
-          <w:rFonts w:ascii="Times New Roman" w:hAnsi="Times New Roman" w:cs="Times New Roman"/>
-          <w:b/>
-          <w:bCs/>
-          <w:sz w:val="24"/>
-          <w:szCs w:val="24"/>
-        </w:rPr>
-        <w:t>Evaluating multiple models using labeled and unlabeled data</w:t>
-      </w:r>
-    </w:p>
-    <w:p>
-      <w:pPr>
-        <w:tabs>
-          <w:tab w:val="right" w:pos="9360"/>
-        </w:tabs>
-        <w:autoSpaceDE w:val="0"/>
-        <w:autoSpaceDN w:val="0"/>
-        <w:adjustRightInd w:val="0"/>
-        <w:spacing w:after="0" w:line="240" w:lineRule="auto"/>
-        <w:rPr>
-          <w:rFonts w:ascii="Times New Roman" w:hAnsi="Times New Roman" w:cs="Times New Roman"/>
-          <w:sz w:val="24"/>
-          <w:szCs w:val="24"/>
-        </w:rPr>
-      </w:pPr>
-      <w:r>
-        <w:rPr>
-          <w:rFonts w:ascii="Times New Roman" w:hAnsi="Times New Roman" w:cs="Times New Roman"/>
-          <w:sz w:val="24"/>
-          <w:szCs w:val="24"/>
-        </w:rPr>
-        <w:t>MIT, Machine Learning Tea</w:t>
-      </w:r>
-      <w:r>
-        <w:rPr>
-          <w:rFonts w:ascii="Times New Roman" w:hAnsi="Times New Roman" w:cs="Times New Roman"/>
-          <w:sz w:val="24"/>
-          <w:szCs w:val="24"/>
-        </w:rPr>
-        <w:tab/>
-        <w:t>2025</w:t>
-      </w:r>
-    </w:p>
-    <w:p>
-      <w:pPr>
-        <w:tabs>
-          <w:tab w:val="right" w:pos="9360"/>
-        </w:tabs>
-        <w:autoSpaceDE w:val="0"/>
-        <w:autoSpaceDN w:val="0"/>
-        <w:adjustRightInd w:val="0"/>
-        <w:spacing w:after="0" w:line="240" w:lineRule="auto"/>
-        <w:rPr>
-          <w:rFonts w:ascii="Times New Roman" w:hAnsi="Times New Roman" w:cs="Times New Roman"/>
-          <w:sz w:val="24"/>
-          <w:szCs w:val="24"/>
-        </w:rPr>
-      </w:pPr>
-    </w:p>
-    <w:p>
-      <w:pPr>
-        <w:tabs>
-          <w:tab w:val="right" w:pos="9360"/>
-        </w:tabs>
-        <w:autoSpaceDE w:val="0"/>
-        <w:autoSpaceDN w:val="0"/>
-        <w:adjustRightInd w:val="0"/>
-        <w:spacing w:after="0" w:line="240" w:lineRule="auto"/>
-        <w:rPr>
-          <w:rFonts w:ascii="Times New Roman" w:hAnsi="Times New Roman" w:cs="Times New Roman"/>
-          <w:sz w:val="24"/>
-          <w:szCs w:val="24"/>
-        </w:rPr>
-      </w:pPr>
-      <w:r>
-        <w:rPr>
-          <w:rFonts w:ascii="Times New Roman" w:hAnsi="Times New Roman" w:cs="Times New Roman"/>
-          <w:b/>
-          <w:bCs/>
-          <w:sz w:val="24"/>
-          <w:szCs w:val="24"/>
-        </w:rPr>
-        <w:t>Assessing transcriptomic reidentification risks</w:t>
-      </w:r>
-      <w:r>
-        <w:rPr>
-          <w:rFonts w:ascii="Times New Roman" w:hAnsi="Times New Roman" w:cs="Times New Roman"/>
-          <w:b/>
-          <w:bCs/>
-          <w:sz w:val="24"/>
-          <w:szCs w:val="24"/>
-        </w:rPr>
-        <w:tab/>
-      </w:r>
-    </w:p>
-    <w:p>
-      <w:pPr>
-        <w:tabs>
-          <w:tab w:val="right" w:pos="9360"/>
-        </w:tabs>
-        <w:autoSpaceDE w:val="0"/>
-        <w:autoSpaceDN w:val="0"/>
-        <w:adjustRightInd w:val="0"/>
-        <w:spacing w:after="0" w:line="240" w:lineRule="auto"/>
-        <w:rPr>
-          <w:rFonts w:ascii="Times New Roman" w:hAnsi="Times New Roman" w:cs="Times New Roman"/>
-          <w:sz w:val="24"/>
-          <w:szCs w:val="24"/>
-        </w:rPr>
-      </w:pPr>
-      <w:r>
-        <w:rPr>
-          <w:rFonts w:ascii="Times New Roman" w:hAnsi="Times New Roman" w:cs="Times New Roman"/>
-          <w:sz w:val="24"/>
-          <w:szCs w:val="24"/>
-        </w:rPr>
-        <w:t>RECOMB</w:t>
-      </w:r>
-      <w:r>
-        <w:rPr>
-          <w:rFonts w:ascii="Times New Roman" w:hAnsi="Times New Roman" w:cs="Times New Roman"/>
-          <w:sz w:val="24"/>
-          <w:szCs w:val="24"/>
-        </w:rPr>
-        <w:t>, Oral Presentation</w:t>
       </w:r>
       <w:r>
         <w:rPr>
@@ -2690,6 +2386,243 @@
           <w:szCs w:val="24"/>
         </w:rPr>
         <w:tab/>
+      </w:r>
+      <w:r>
+        <w:rPr>
+          <w:rFonts w:ascii="Times New Roman" w:hAnsi="Times New Roman" w:cs="Times New Roman"/>
+          <w:sz w:val="24"/>
+          <w:szCs w:val="24"/>
+        </w:rPr>
+        <w:t>2026</w:t>
+      </w:r>
+    </w:p>
+    <w:p>
+      <w:pPr>
+        <w:tabs>
+          <w:tab w:val="right" w:pos="9360"/>
+        </w:tabs>
+        <w:autoSpaceDE w:val="0"/>
+        <w:autoSpaceDN w:val="0"/>
+        <w:adjustRightInd w:val="0"/>
+        <w:spacing w:after="0" w:line="240" w:lineRule="auto"/>
+        <w:rPr>
+          <w:rFonts w:ascii="Times New Roman" w:hAnsi="Times New Roman" w:cs="Times New Roman"/>
+          <w:sz w:val="24"/>
+          <w:szCs w:val="24"/>
+        </w:rPr>
+      </w:pPr>
+      <w:r>
+        <w:rPr>
+          <w:rFonts w:ascii="Times New Roman" w:hAnsi="Times New Roman" w:cs="Times New Roman"/>
+          <w:sz w:val="24"/>
+          <w:szCs w:val="24"/>
+        </w:rPr>
+        <w:t xml:space="preserve">MIT, Algorithms Coffee                                                                                                           </w:t>
+      </w:r>
+      <w:r>
+        <w:rPr>
+          <w:rFonts w:ascii="Times New Roman" w:hAnsi="Times New Roman" w:cs="Times New Roman"/>
+          <w:sz w:val="24"/>
+          <w:szCs w:val="24"/>
+        </w:rPr>
+        <w:tab/>
+        <w:t>2026</w:t>
+      </w:r>
+    </w:p>
+    <w:p>
+      <w:pPr>
+        <w:tabs>
+          <w:tab w:val="right" w:pos="9360"/>
+        </w:tabs>
+        <w:autoSpaceDE w:val="0"/>
+        <w:autoSpaceDN w:val="0"/>
+        <w:adjustRightInd w:val="0"/>
+        <w:spacing w:after="0" w:line="240" w:lineRule="auto"/>
+        <w:rPr>
+          <w:rFonts w:ascii="Times New Roman" w:hAnsi="Times New Roman" w:cs="Times New Roman"/>
+          <w:sz w:val="24"/>
+          <w:szCs w:val="24"/>
+        </w:rPr>
+      </w:pPr>
+    </w:p>
+    <w:p>
+      <w:pPr>
+        <w:tabs>
+          <w:tab w:val="right" w:pos="9360"/>
+        </w:tabs>
+        <w:autoSpaceDE w:val="0"/>
+        <w:autoSpaceDN w:val="0"/>
+        <w:adjustRightInd w:val="0"/>
+        <w:spacing w:after="0" w:line="240" w:lineRule="auto"/>
+        <w:rPr>
+          <w:rFonts w:ascii="Times New Roman" w:hAnsi="Times New Roman" w:cs="Times New Roman"/>
+          <w:b/>
+          <w:bCs/>
+          <w:sz w:val="24"/>
+          <w:szCs w:val="24"/>
+        </w:rPr>
+      </w:pPr>
+      <w:r>
+        <w:rPr>
+          <w:rFonts w:ascii="Times New Roman" w:hAnsi="Times New Roman" w:cs="Times New Roman"/>
+          <w:b/>
+          <w:bCs/>
+          <w:sz w:val="24"/>
+          <w:szCs w:val="24"/>
+        </w:rPr>
+        <w:t>Evaluating multiple models using labeled and unlabeled data</w:t>
+      </w:r>
+    </w:p>
+    <w:p>
+      <w:pPr>
+        <w:tabs>
+          <w:tab w:val="right" w:pos="9360"/>
+        </w:tabs>
+        <w:autoSpaceDE w:val="0"/>
+        <w:autoSpaceDN w:val="0"/>
+        <w:adjustRightInd w:val="0"/>
+        <w:spacing w:after="0" w:line="240" w:lineRule="auto"/>
+        <w:rPr>
+          <w:rFonts w:ascii="Times New Roman" w:hAnsi="Times New Roman" w:cs="Times New Roman"/>
+          <w:sz w:val="24"/>
+          <w:szCs w:val="24"/>
+        </w:rPr>
+      </w:pPr>
+      <w:r>
+        <w:rPr>
+          <w:rFonts w:ascii="Times New Roman" w:hAnsi="Times New Roman" w:cs="Times New Roman"/>
+          <w:sz w:val="24"/>
+          <w:szCs w:val="24"/>
+        </w:rPr>
+        <w:t>MIT, Machine Learning Tea</w:t>
+      </w:r>
+      <w:r>
+        <w:rPr>
+          <w:rFonts w:ascii="Times New Roman" w:hAnsi="Times New Roman" w:cs="Times New Roman"/>
+          <w:sz w:val="24"/>
+          <w:szCs w:val="24"/>
+        </w:rPr>
+        <w:tab/>
+        <w:t>2025</w:t>
+      </w:r>
+    </w:p>
+    <w:p>
+      <w:pPr>
+        <w:tabs>
+          <w:tab w:val="right" w:pos="9360"/>
+        </w:tabs>
+        <w:autoSpaceDE w:val="0"/>
+        <w:autoSpaceDN w:val="0"/>
+        <w:adjustRightInd w:val="0"/>
+        <w:spacing w:after="0" w:line="240" w:lineRule="auto"/>
+        <w:rPr>
+          <w:rFonts w:ascii="Times New Roman" w:hAnsi="Times New Roman" w:cs="Times New Roman"/>
+          <w:sz w:val="24"/>
+          <w:szCs w:val="24"/>
+        </w:rPr>
+      </w:pPr>
+    </w:p>
+    <w:p>
+      <w:pPr>
+        <w:tabs>
+          <w:tab w:val="right" w:pos="9360"/>
+        </w:tabs>
+        <w:autoSpaceDE w:val="0"/>
+        <w:autoSpaceDN w:val="0"/>
+        <w:adjustRightInd w:val="0"/>
+        <w:spacing w:after="0" w:line="240" w:lineRule="auto"/>
+        <w:rPr>
+          <w:rFonts w:ascii="Times New Roman" w:hAnsi="Times New Roman" w:cs="Times New Roman"/>
+          <w:sz w:val="24"/>
+          <w:szCs w:val="24"/>
+        </w:rPr>
+      </w:pPr>
+      <w:r>
+        <w:rPr>
+          <w:rFonts w:ascii="Times New Roman" w:hAnsi="Times New Roman" w:cs="Times New Roman"/>
+          <w:b/>
+          <w:bCs/>
+          <w:sz w:val="24"/>
+          <w:szCs w:val="24"/>
+        </w:rPr>
+        <w:t>Assessing transcriptomic reidentification risks</w:t>
+      </w:r>
+      <w:r>
+        <w:rPr>
+          <w:rFonts w:ascii="Times New Roman" w:hAnsi="Times New Roman" w:cs="Times New Roman"/>
+          <w:b/>
+          <w:bCs/>
+          <w:sz w:val="24"/>
+          <w:szCs w:val="24"/>
+        </w:rPr>
+        <w:tab/>
+      </w:r>
+    </w:p>
+    <w:p>
+      <w:pPr>
+        <w:tabs>
+          <w:tab w:val="right" w:pos="9360"/>
+        </w:tabs>
+        <w:autoSpaceDE w:val="0"/>
+        <w:autoSpaceDN w:val="0"/>
+        <w:adjustRightInd w:val="0"/>
+        <w:spacing w:after="0" w:line="240" w:lineRule="auto"/>
+        <w:rPr>
+          <w:rFonts w:ascii="Times New Roman" w:hAnsi="Times New Roman" w:cs="Times New Roman"/>
+          <w:sz w:val="24"/>
+          <w:szCs w:val="24"/>
+        </w:rPr>
+      </w:pPr>
+      <w:r>
+        <w:rPr>
+          <w:rFonts w:ascii="Times New Roman" w:hAnsi="Times New Roman" w:cs="Times New Roman"/>
+          <w:sz w:val="24"/>
+          <w:szCs w:val="24"/>
+        </w:rPr>
+        <w:t>RECOMB</w:t>
+      </w:r>
+      <w:r>
+        <w:rPr>
+          <w:rFonts w:ascii="Times New Roman" w:hAnsi="Times New Roman" w:cs="Times New Roman"/>
+          <w:sz w:val="24"/>
+          <w:szCs w:val="24"/>
+        </w:rPr>
+        <w:t>, Oral Presentation</w:t>
+      </w:r>
+      <w:r>
+        <w:rPr>
+          <w:rFonts w:ascii="Times New Roman" w:hAnsi="Times New Roman" w:cs="Times New Roman"/>
+          <w:sz w:val="24"/>
+          <w:szCs w:val="24"/>
+        </w:rPr>
+        <w:t xml:space="preserve"> [</w:t>
+      </w:r>
+      <w:hyperlink r:id="rId15" w:history="1">
+        <w:r>
+          <w:rPr>
+            <w:rStyle w:val="Hyperlink"/>
+            <w:rFonts w:ascii="Times New Roman" w:hAnsi="Times New Roman" w:cs="Times New Roman"/>
+            <w:sz w:val="24"/>
+            <w:szCs w:val="24"/>
+          </w:rPr>
+          <w:t>YouTube</w:t>
+        </w:r>
+      </w:hyperlink>
+      <w:r>
+        <w:rPr>
+          <w:rFonts w:ascii="Times New Roman" w:hAnsi="Times New Roman" w:cs="Times New Roman"/>
+          <w:sz w:val="24"/>
+          <w:szCs w:val="24"/>
+        </w:rPr>
+        <w:t>]</w:t>
+      </w:r>
+      <w:r>
+        <w:rPr>
+          <w:rFonts w:ascii="Times New Roman" w:hAnsi="Times New Roman" w:cs="Times New Roman"/>
+          <w:sz w:val="24"/>
+          <w:szCs w:val="24"/>
+        </w:rPr>
+        <w:tab/>
         <w:t>202</w:t>
       </w:r>
       <w:r>
@@ -3383,25 +3316,7 @@
           <w:sz w:val="24"/>
           <w:szCs w:val="24"/>
         </w:rPr>
-        <w:t xml:space="preserve">Reviewing: </w:t>
-      </w:r>
-      <w:proofErr w:type="spellStart"/>
-      <w:r>
-        <w:rPr>
-          <w:rFonts w:ascii="Times New Roman" w:hAnsi="Times New Roman" w:cs="Times New Roman"/>
-          <w:sz w:val="24"/>
-          <w:szCs w:val="24"/>
-        </w:rPr>
-        <w:t>NeurIPS</w:t>
-      </w:r>
-      <w:proofErr w:type="spellEnd"/>
-      <w:r>
-        <w:rPr>
-          <w:rFonts w:ascii="Times New Roman" w:hAnsi="Times New Roman" w:cs="Times New Roman"/>
-          <w:sz w:val="24"/>
-          <w:szCs w:val="24"/>
-        </w:rPr>
-        <w:t xml:space="preserve">, </w:t>
+        <w:t xml:space="preserve">Reviewing: NeurIPS, </w:t>
       </w:r>
       <w:r>
         <w:rPr>
@@ -3492,7 +3407,6 @@
           <w:sz w:val="24"/>
           <w:szCs w:val="24"/>
         </w:rPr>
-        <w:lastRenderedPageBreak/>
         <w:t>LEADERSHIP &amp; OUTREACH</w:t>
       </w:r>
       <w:r>
@@ -4165,27 +4079,7 @@
           <w:sz w:val="24"/>
           <w:szCs w:val="24"/>
         </w:rPr>
-        <w:t xml:space="preserve">Mentors: </w:t>
-      </w:r>
-      <w:proofErr w:type="spellStart"/>
-      <w:r>
-        <w:rPr>
-          <w:rFonts w:ascii="Times New Roman" w:hAnsi="Times New Roman" w:cs="Times New Roman"/>
-          <w:bCs/>
-          <w:sz w:val="24"/>
-          <w:szCs w:val="24"/>
-        </w:rPr>
-        <w:t>Hanchen</w:t>
-      </w:r>
-      <w:proofErr w:type="spellEnd"/>
-      <w:r>
-        <w:rPr>
-          <w:rFonts w:ascii="Times New Roman" w:hAnsi="Times New Roman" w:cs="Times New Roman"/>
-          <w:bCs/>
-          <w:sz w:val="24"/>
-          <w:szCs w:val="24"/>
-        </w:rPr>
-        <w:t xml:space="preserve"> Wang, Aviv Regev</w:t>
+        <w:t>Mentors: Hanchen Wang, Aviv Regev</w:t>
       </w:r>
     </w:p>
     <w:p>
@@ -4430,7 +4324,7 @@
           <w:szCs w:val="24"/>
         </w:rPr>
       </w:pPr>
-      <w:hyperlink r:id="rId15" w:history="1">
+      <w:hyperlink r:id="rId16" w:history="1">
         <w:r>
           <w:rPr>
             <w:rStyle w:val="Hyperlink"/>
@@ -4467,23 +4361,13 @@
           <w:szCs w:val="24"/>
         </w:rPr>
       </w:pPr>
-      <w:proofErr w:type="spellStart"/>
-      <w:r>
-        <w:rPr>
-          <w:rFonts w:ascii="Times New Roman" w:hAnsi="Times New Roman" w:cs="Times New Roman"/>
-          <w:sz w:val="24"/>
-          <w:szCs w:val="24"/>
-        </w:rPr>
-        <w:t>Hanchen</w:t>
-      </w:r>
-      <w:proofErr w:type="spellEnd"/>
-      <w:r>
-        <w:rPr>
-          <w:rFonts w:ascii="Times New Roman" w:hAnsi="Times New Roman" w:cs="Times New Roman"/>
-          <w:sz w:val="24"/>
-          <w:szCs w:val="24"/>
-        </w:rPr>
-        <w:t xml:space="preserve"> Wang</w:t>
+      <w:r>
+        <w:rPr>
+          <w:rFonts w:ascii="Times New Roman" w:hAnsi="Times New Roman" w:cs="Times New Roman"/>
+          <w:sz w:val="24"/>
+          <w:szCs w:val="24"/>
+        </w:rPr>
+        <w:t>Hanchen Wang</w:t>
       </w:r>
     </w:p>
     <w:p>
@@ -4540,7 +4424,7 @@
           <w:szCs w:val="24"/>
         </w:rPr>
       </w:pPr>
-      <w:hyperlink r:id="rId16" w:history="1">
+      <w:hyperlink r:id="rId17" w:history="1">
         <w:r>
           <w:rPr>
             <w:rStyle w:val="Hyperlink"/>
@@ -4648,7 +4532,7 @@
           <w:szCs w:val="24"/>
         </w:rPr>
       </w:pPr>
-      <w:hyperlink r:id="rId17" w:history="1">
+      <w:hyperlink r:id="rId18" w:history="1">
         <w:r>
           <w:rPr>
             <w:rStyle w:val="Hyperlink"/>
@@ -4721,7 +4605,7 @@
       </w:pPr>
     </w:p>
     <w:sectPr>
-      <w:footerReference w:type="default" r:id="rId18"/>
+      <w:footerReference w:type="default" r:id="rId19"/>
       <w:pgSz w:w="12240" w:h="15840"/>
       <w:pgMar w:top="1440" w:right="1440" w:bottom="1440" w:left="1440" w:header="720" w:footer="720" w:gutter="0"/>
       <w:cols w:space="720"/>

</xml_diff>